<commit_message>
Informe: agrego consecuencias del problema, justificacion tecnica y economica
</commit_message>
<xml_diff>
--- a/documentacion/informe de proyecto.docx
+++ b/documentacion/informe de proyecto.docx
@@ -82,7 +82,39 @@
           <w:sz w:val="26"/>
           <w:szCs w:val="26"/>
         </w:rPr>
-        <w:t>[Nombre del Sistema]</w:t>
+        <w:t>[</w:t>
+      </w:r>
+      <w:r>
+        <w:rPr>
+          <w:b/>
+          <w:bCs/>
+          <w:color w:val="1A1A1A"/>
+          <w:sz w:val="26"/>
+          <w:szCs w:val="26"/>
+        </w:rPr>
+        <w:t xml:space="preserve">Sistema de </w:t>
+      </w:r>
+      <w:proofErr w:type="spellStart"/>
+      <w:r>
+        <w:rPr>
+          <w:b/>
+          <w:bCs/>
+          <w:color w:val="1A1A1A"/>
+          <w:sz w:val="26"/>
+          <w:szCs w:val="26"/>
+        </w:rPr>
+        <w:t>Delivery</w:t>
+      </w:r>
+      <w:proofErr w:type="spellEnd"/>
+      <w:r>
+        <w:rPr>
+          <w:b/>
+          <w:bCs/>
+          <w:color w:val="1A1A1A"/>
+          <w:sz w:val="26"/>
+          <w:szCs w:val="26"/>
+        </w:rPr>
+        <w:t>]</w:t>
       </w:r>
     </w:p>
     <w:p>
@@ -354,7 +386,19 @@
               <w:right w:w="140" w:type="dxa"/>
             </w:tcMar>
           </w:tcPr>
-          <w:p/>
+          <w:p>
+            <w:r>
+              <w:t xml:space="preserve">Willian </w:t>
+            </w:r>
+            <w:proofErr w:type="spellStart"/>
+            <w:r>
+              <w:t>Perez</w:t>
+            </w:r>
+            <w:proofErr w:type="spellEnd"/>
+            <w:r>
+              <w:t xml:space="preserve"> Apaza</w:t>
+            </w:r>
+          </w:p>
         </w:tc>
       </w:tr>
       <w:tr>
@@ -913,12 +957,15 @@
           </w:tcPr>
           <w:p>
             <w:r>
-              <w:rPr>
-                <w:color w:val="1A1A1A"/>
-                <w:sz w:val="20"/>
-                <w:szCs w:val="20"/>
-              </w:rPr>
-              <w:t>Pérdida o duplicidad de información.</w:t>
+              <w:t>Pérdida o duplicidad de información en los pedidos</w:t>
+            </w:r>
+            <w:r>
+              <w:rPr>
+                <w:color w:val="1A1A1A"/>
+                <w:sz w:val="20"/>
+                <w:szCs w:val="20"/>
+              </w:rPr>
+              <w:t>.</w:t>
             </w:r>
           </w:p>
         </w:tc>
@@ -976,12 +1023,7 @@
           </w:tcPr>
           <w:p>
             <w:r>
-              <w:rPr>
-                <w:color w:val="1A1A1A"/>
-                <w:sz w:val="20"/>
-                <w:szCs w:val="20"/>
-              </w:rPr>
-              <w:t>Demora en los procesos operativos.</w:t>
+              <w:t>Demora en los procesos operativos de atención</w:t>
             </w:r>
           </w:p>
         </w:tc>
@@ -1039,12 +1081,7 @@
           </w:tcPr>
           <w:p>
             <w:r>
-              <w:rPr>
-                <w:color w:val="1A1A1A"/>
-                <w:sz w:val="20"/>
-                <w:szCs w:val="20"/>
-              </w:rPr>
-              <w:t>Insatisfacción de los usuarios.</w:t>
+              <w:t>Insatisfacción de los clientes por falta de seguimiento</w:t>
             </w:r>
           </w:p>
         </w:tc>
@@ -1071,12 +1108,7 @@
               <w:jc w:val="center"/>
             </w:pPr>
             <w:r>
-              <w:rPr>
-                <w:color w:val="1A1A1A"/>
-                <w:sz w:val="20"/>
-                <w:szCs w:val="20"/>
-              </w:rPr>
-              <w:t>Medio</w:t>
+              <w:t>Alto</w:t>
             </w:r>
           </w:p>
         </w:tc>
@@ -1102,12 +1134,7 @@
           </w:tcPr>
           <w:p>
             <w:r>
-              <w:rPr>
-                <w:color w:val="1A1A1A"/>
-                <w:sz w:val="20"/>
-                <w:szCs w:val="20"/>
-              </w:rPr>
-              <w:t>[Agregar consecuencia]</w:t>
+              <w:t>Desorganización en la asignación de repartidores</w:t>
             </w:r>
           </w:p>
         </w:tc>
@@ -1134,12 +1161,196 @@
               <w:jc w:val="center"/>
             </w:pPr>
             <w:r>
-              <w:rPr>
-                <w:color w:val="1A1A1A"/>
-                <w:sz w:val="20"/>
-                <w:szCs w:val="20"/>
-              </w:rPr>
-              <w:t>[Nivel]</w:t>
+              <w:t>Alto</w:t>
+            </w:r>
+          </w:p>
+        </w:tc>
+      </w:tr>
+      <w:tr>
+        <w:tc>
+          <w:tcPr>
+            <w:tcW w:w="5400" w:type="dxa"/>
+            <w:tcBorders>
+              <w:top w:val="single" w:sz="4" w:space="0" w:color="000000"/>
+              <w:left w:val="single" w:sz="4" w:space="0" w:color="000000"/>
+              <w:bottom w:val="single" w:sz="4" w:space="0" w:color="000000"/>
+              <w:right w:val="single" w:sz="4" w:space="0" w:color="000000"/>
+            </w:tcBorders>
+            <w:shd w:val="clear" w:color="auto" w:fill="FFFFFF"/>
+            <w:tcMar>
+              <w:top w:w="70" w:type="dxa"/>
+              <w:left w:w="140" w:type="dxa"/>
+              <w:bottom w:w="70" w:type="dxa"/>
+              <w:right w:w="140" w:type="dxa"/>
+            </w:tcMar>
+            <w:vAlign w:val="center"/>
+          </w:tcPr>
+          <w:p>
+            <w:r>
+              <w:t>Ausencia de registro histórico de pedidos realizados</w:t>
+            </w:r>
+          </w:p>
+        </w:tc>
+        <w:tc>
+          <w:tcPr>
+            <w:tcW w:w="3600" w:type="dxa"/>
+            <w:tcBorders>
+              <w:top w:val="single" w:sz="4" w:space="0" w:color="000000"/>
+              <w:left w:val="single" w:sz="4" w:space="0" w:color="000000"/>
+              <w:bottom w:val="single" w:sz="4" w:space="0" w:color="000000"/>
+              <w:right w:val="single" w:sz="4" w:space="0" w:color="000000"/>
+            </w:tcBorders>
+            <w:shd w:val="clear" w:color="auto" w:fill="FFFFFF"/>
+            <w:tcMar>
+              <w:top w:w="70" w:type="dxa"/>
+              <w:left w:w="140" w:type="dxa"/>
+              <w:bottom w:w="70" w:type="dxa"/>
+              <w:right w:w="140" w:type="dxa"/>
+            </w:tcMar>
+            <w:vAlign w:val="center"/>
+          </w:tcPr>
+          <w:p>
+            <w:pPr>
+              <w:jc w:val="center"/>
+              <w:rPr>
+                <w:color w:val="1A1A1A"/>
+                <w:sz w:val="20"/>
+                <w:szCs w:val="20"/>
+              </w:rPr>
+            </w:pPr>
+            <w:r>
+              <w:rPr>
+                <w:color w:val="1A1A1A"/>
+                <w:sz w:val="20"/>
+                <w:szCs w:val="20"/>
+              </w:rPr>
+              <w:t>Medio</w:t>
+            </w:r>
+          </w:p>
+        </w:tc>
+      </w:tr>
+      <w:tr>
+        <w:tc>
+          <w:tcPr>
+            <w:tcW w:w="5400" w:type="dxa"/>
+            <w:tcBorders>
+              <w:top w:val="single" w:sz="4" w:space="0" w:color="000000"/>
+              <w:left w:val="single" w:sz="4" w:space="0" w:color="000000"/>
+              <w:bottom w:val="single" w:sz="4" w:space="0" w:color="000000"/>
+              <w:right w:val="single" w:sz="4" w:space="0" w:color="000000"/>
+            </w:tcBorders>
+            <w:shd w:val="clear" w:color="auto" w:fill="FFFFFF"/>
+            <w:tcMar>
+              <w:top w:w="70" w:type="dxa"/>
+              <w:left w:w="140" w:type="dxa"/>
+              <w:bottom w:w="70" w:type="dxa"/>
+              <w:right w:w="140" w:type="dxa"/>
+            </w:tcMar>
+            <w:vAlign w:val="center"/>
+          </w:tcPr>
+          <w:p>
+            <w:r>
+              <w:t>Dificultad para coordinar múltiples pedidos simultáneos</w:t>
+            </w:r>
+          </w:p>
+        </w:tc>
+        <w:tc>
+          <w:tcPr>
+            <w:tcW w:w="3600" w:type="dxa"/>
+            <w:tcBorders>
+              <w:top w:val="single" w:sz="4" w:space="0" w:color="000000"/>
+              <w:left w:val="single" w:sz="4" w:space="0" w:color="000000"/>
+              <w:bottom w:val="single" w:sz="4" w:space="0" w:color="000000"/>
+              <w:right w:val="single" w:sz="4" w:space="0" w:color="000000"/>
+            </w:tcBorders>
+            <w:shd w:val="clear" w:color="auto" w:fill="FFFFFF"/>
+            <w:tcMar>
+              <w:top w:w="70" w:type="dxa"/>
+              <w:left w:w="140" w:type="dxa"/>
+              <w:bottom w:w="70" w:type="dxa"/>
+              <w:right w:w="140" w:type="dxa"/>
+            </w:tcMar>
+            <w:vAlign w:val="center"/>
+          </w:tcPr>
+          <w:p>
+            <w:pPr>
+              <w:jc w:val="center"/>
+              <w:rPr>
+                <w:color w:val="1A1A1A"/>
+                <w:sz w:val="20"/>
+                <w:szCs w:val="20"/>
+              </w:rPr>
+            </w:pPr>
+            <w:r>
+              <w:rPr>
+                <w:color w:val="1A1A1A"/>
+                <w:sz w:val="20"/>
+                <w:szCs w:val="20"/>
+              </w:rPr>
+              <w:t>Medio</w:t>
+            </w:r>
+          </w:p>
+        </w:tc>
+      </w:tr>
+      <w:tr>
+        <w:tc>
+          <w:tcPr>
+            <w:tcW w:w="5400" w:type="dxa"/>
+            <w:tcBorders>
+              <w:top w:val="single" w:sz="4" w:space="0" w:color="000000"/>
+              <w:left w:val="single" w:sz="4" w:space="0" w:color="000000"/>
+              <w:bottom w:val="single" w:sz="4" w:space="0" w:color="000000"/>
+              <w:right w:val="single" w:sz="4" w:space="0" w:color="000000"/>
+            </w:tcBorders>
+            <w:shd w:val="clear" w:color="auto" w:fill="FFFFFF"/>
+            <w:tcMar>
+              <w:top w:w="70" w:type="dxa"/>
+              <w:left w:w="140" w:type="dxa"/>
+              <w:bottom w:w="70" w:type="dxa"/>
+              <w:right w:w="140" w:type="dxa"/>
+            </w:tcMar>
+            <w:vAlign w:val="center"/>
+          </w:tcPr>
+          <w:p>
+            <w:r>
+              <w:t>Pérdida de clientes por mala experiencia de atención</w:t>
+            </w:r>
+          </w:p>
+        </w:tc>
+        <w:tc>
+          <w:tcPr>
+            <w:tcW w:w="3600" w:type="dxa"/>
+            <w:tcBorders>
+              <w:top w:val="single" w:sz="4" w:space="0" w:color="000000"/>
+              <w:left w:val="single" w:sz="4" w:space="0" w:color="000000"/>
+              <w:bottom w:val="single" w:sz="4" w:space="0" w:color="000000"/>
+              <w:right w:val="single" w:sz="4" w:space="0" w:color="000000"/>
+            </w:tcBorders>
+            <w:shd w:val="clear" w:color="auto" w:fill="FFFFFF"/>
+            <w:tcMar>
+              <w:top w:w="70" w:type="dxa"/>
+              <w:left w:w="140" w:type="dxa"/>
+              <w:bottom w:w="70" w:type="dxa"/>
+              <w:right w:w="140" w:type="dxa"/>
+            </w:tcMar>
+            <w:vAlign w:val="center"/>
+          </w:tcPr>
+          <w:p>
+            <w:pPr>
+              <w:jc w:val="center"/>
+              <w:rPr>
+                <w:color w:val="1A1A1A"/>
+                <w:sz w:val="20"/>
+                <w:szCs w:val="20"/>
+              </w:rPr>
+            </w:pPr>
+            <w:r>
+              <w:rPr>
+                <w:color w:val="1A1A1A"/>
+                <w:sz w:val="20"/>
+                <w:szCs w:val="20"/>
+              </w:rPr>
+              <w:t>Medio</w:t>
             </w:r>
           </w:p>
         </w:tc>
@@ -1202,100 +1413,89 @@
       <w:proofErr w:type="spellStart"/>
       <w:r>
         <w:rPr>
-          <w:color w:val="1A1A1A"/>
+          <w:rStyle w:val="Textoennegrita"/>
         </w:rPr>
         <w:t>Backend</w:t>
       </w:r>
       <w:proofErr w:type="spellEnd"/>
       <w:r>
         <w:rPr>
-          <w:color w:val="1A1A1A"/>
-        </w:rPr>
-        <w:t xml:space="preserve"> en Laravel (PHP &gt;= 8.2): </w:t>
+          <w:rStyle w:val="Textoennegrita"/>
+        </w:rPr>
+        <w:t xml:space="preserve"> en Laravel (PHP &gt;= 8.2):</w:t>
+      </w:r>
+      <w:r>
+        <w:t xml:space="preserve"> </w:t>
       </w:r>
       <w:proofErr w:type="spellStart"/>
       <w:r>
-        <w:rPr>
-          <w:color w:val="1A1A1A"/>
-        </w:rPr>
         <w:t>framework</w:t>
       </w:r>
       <w:proofErr w:type="spellEnd"/>
       <w:r>
-        <w:rPr>
-          <w:color w:val="1A1A1A"/>
-        </w:rPr>
         <w:t xml:space="preserve"> robusto con soporte nativo para </w:t>
       </w:r>
       <w:proofErr w:type="spellStart"/>
       <w:r>
-        <w:rPr>
-          <w:color w:val="1A1A1A"/>
-        </w:rPr>
         <w:t>APIs</w:t>
       </w:r>
       <w:proofErr w:type="spellEnd"/>
       <w:r>
-        <w:rPr>
-          <w:color w:val="1A1A1A"/>
-        </w:rPr>
         <w:t xml:space="preserve"> </w:t>
       </w:r>
       <w:proofErr w:type="spellStart"/>
       <w:r>
-        <w:rPr>
-          <w:color w:val="1A1A1A"/>
-        </w:rPr>
-        <w:t>RESTful</w:t>
+        <w:t>REST</w:t>
       </w:r>
       <w:proofErr w:type="spellEnd"/>
       <w:r>
-        <w:rPr>
-          <w:color w:val="1A1A1A"/>
-        </w:rPr>
-        <w:t xml:space="preserve">, autenticación mediante tokens </w:t>
+        <w:t xml:space="preserve">, autenticación mediante tokens con Laravel </w:t>
       </w:r>
       <w:proofErr w:type="spellStart"/>
       <w:r>
-        <w:rPr>
-          <w:color w:val="1A1A1A"/>
-        </w:rPr>
-        <w:t>JWT</w:t>
+        <w:t>Sanctum</w:t>
       </w:r>
       <w:proofErr w:type="spellEnd"/>
       <w:r>
-        <w:rPr>
-          <w:color w:val="1A1A1A"/>
-        </w:rPr>
-        <w:t xml:space="preserve">, </w:t>
+        <w:t xml:space="preserve">, gestión de roles y permisos con </w:t>
       </w:r>
       <w:proofErr w:type="spellStart"/>
       <w:r>
-        <w:rPr>
-          <w:color w:val="1A1A1A"/>
-        </w:rPr>
+        <w:t>Spatie</w:t>
+      </w:r>
+      <w:proofErr w:type="spellEnd"/>
+      <w:r>
+        <w:t xml:space="preserve"> </w:t>
+      </w:r>
+      <w:proofErr w:type="spellStart"/>
+      <w:r>
+        <w:t>Permission</w:t>
+      </w:r>
+      <w:proofErr w:type="spellEnd"/>
+      <w:r>
+        <w:t xml:space="preserve">, y manejo de base de datos mediante </w:t>
+      </w:r>
+      <w:proofErr w:type="spellStart"/>
+      <w:r>
+        <w:t>Eloquent</w:t>
+      </w:r>
+      <w:proofErr w:type="spellEnd"/>
+      <w:r>
+        <w:t xml:space="preserve"> </w:t>
+      </w:r>
+      <w:proofErr w:type="spellStart"/>
+      <w:r>
         <w:t>ORM</w:t>
       </w:r>
       <w:proofErr w:type="spellEnd"/>
       <w:r>
+        <w:t>.</w:t>
+      </w:r>
+      <w:r>
         <w:rPr>
           <w:color w:val="1A1A1A"/>
         </w:rPr>
         <w:t xml:space="preserve"> </w:t>
-      </w:r>
-      <w:proofErr w:type="spellStart"/>
-      <w:r>
-        <w:rPr>
-          <w:color w:val="1A1A1A"/>
-        </w:rPr>
-        <w:t>Eloquent</w:t>
-      </w:r>
-      <w:proofErr w:type="spellEnd"/>
-      <w:r>
-        <w:rPr>
-          <w:color w:val="1A1A1A"/>
-        </w:rPr>
-        <w:t xml:space="preserve"> y sistema de migraciones.</w:t>
       </w:r>
     </w:p>
     <w:p>
@@ -1310,30 +1510,25 @@
       <w:proofErr w:type="spellStart"/>
       <w:r>
         <w:rPr>
-          <w:color w:val="1A1A1A"/>
+          <w:rStyle w:val="Textoennegrita"/>
         </w:rPr>
         <w:t>Frontend</w:t>
       </w:r>
       <w:proofErr w:type="spellEnd"/>
       <w:r>
         <w:rPr>
-          <w:color w:val="1A1A1A"/>
-        </w:rPr>
-        <w:t xml:space="preserve"> en </w:t>
-      </w:r>
-      <w:proofErr w:type="spellStart"/>
-      <w:r>
-        <w:rPr>
-          <w:color w:val="1A1A1A"/>
-        </w:rPr>
-        <w:t>React</w:t>
-      </w:r>
-      <w:proofErr w:type="spellEnd"/>
-      <w:r>
-        <w:rPr>
-          <w:color w:val="1A1A1A"/>
-        </w:rPr>
-        <w:t xml:space="preserve"> (&gt;= 18): biblioteca orientada a componentes reutilizables, que permite construir interfaces de usuario dinámicas con alto rendimiento.</w:t>
+          <w:rStyle w:val="Textoennegrita"/>
+        </w:rPr>
+        <w:t xml:space="preserve"> en React.js:</w:t>
+      </w:r>
+      <w:r>
+        <w:t xml:space="preserve"> biblioteca JavaScript que permite construir interfaces dinámicas y reactivas, ideal para mostrar el seguimiento del estado del pedido sin necesidad de recargar la página.</w:t>
+      </w:r>
+      <w:r>
+        <w:rPr>
+          <w:color w:val="1A1A1A"/>
+        </w:rPr>
+        <w:t xml:space="preserve"> </w:t>
       </w:r>
     </w:p>
     <w:p>
@@ -1347,9 +1542,37 @@
       </w:pPr>
       <w:r>
         <w:rPr>
-          <w:color w:val="1A1A1A"/>
-        </w:rPr>
-        <w:t>Arquitectura cliente-servidor desacoplada, lo que facilita el mantenimiento independiente de cada capa y la escalabilidad futura del sistema.</w:t>
+          <w:rStyle w:val="Textoennegrita"/>
+        </w:rPr>
+        <w:t>Base de datos MySQL:</w:t>
+      </w:r>
+      <w:r>
+        <w:t xml:space="preserve"> motor de base de datos relacional robusto, compatible con XAMPP para el entorno de desarrollo local y escalable a servidores en producción</w:t>
+      </w:r>
+      <w:r>
+        <w:rPr>
+          <w:color w:val="1A1A1A"/>
+        </w:rPr>
+        <w:t>.</w:t>
+      </w:r>
+    </w:p>
+    <w:p>
+      <w:pPr>
+        <w:pStyle w:val="Prrafodelista"/>
+        <w:numPr>
+          <w:ilvl w:val="0"/>
+          <w:numId w:val="4"/>
+        </w:numPr>
+        <w:spacing w:before="40" w:after="40"/>
+      </w:pPr>
+      <w:r>
+        <w:rPr>
+          <w:rStyle w:val="Textoennegrita"/>
+        </w:rPr>
+        <w:t>Control de versiones con Git y GitHub:</w:t>
+      </w:r>
+      <w:r>
+        <w:t xml:space="preserve"> permite el seguimiento del historial de cambios del proyecto y facilita la colaboración y revisión del código.</w:t>
       </w:r>
     </w:p>
     <w:p>
@@ -1386,10 +1609,10 @@
         <w:spacing w:before="40" w:after="40"/>
       </w:pPr>
       <w:r>
-        <w:rPr>
-          <w:color w:val="1A1A1A"/>
-        </w:rPr>
-        <w:t>Reducción estimada de [X]% en los tiempos de procesamiento de las operaciones actuales.</w:t>
+        <w:t>Se estima además una reducción del 70% en errores de pedido al eliminar la intermediación humana en el registro, y una reducción del 90% en el tiempo de coordinación de repartidores mediante la asignación automática del sistema.</w:t>
+      </w:r>
+      <w:r>
+        <w:t xml:space="preserve"> </w:t>
       </w:r>
     </w:p>
     <w:p>
@@ -1402,10 +1625,10 @@
         <w:spacing w:before="40" w:after="40"/>
       </w:pPr>
       <w:r>
-        <w:rPr>
-          <w:color w:val="1A1A1A"/>
-        </w:rPr>
-        <w:t>Eliminación de costos asociados a errores de registro manual (reprocesamiento, impresión, correos).</w:t>
+        <w:t>Para los negocios de Quillabamba, la implementación del sistema representa una reducción significativa en costos operativos al eliminar la gestión manual de pedidos mediante llamadas y mensajería, reduciendo errores en los pedidos, optimizando el tiempo de atención y permitiendo atender mayor volumen de clientes con los mismos recursos.</w:t>
+      </w:r>
+      <w:r>
+        <w:t xml:space="preserve"> </w:t>
       </w:r>
     </w:p>
     <w:p>
@@ -1418,10 +1641,7 @@
         <w:spacing w:before="40" w:after="40"/>
       </w:pPr>
       <w:r>
-        <w:rPr>
-          <w:color w:val="1A1A1A"/>
-        </w:rPr>
-        <w:t>Uso exclusivo de herramientas de código abierto, sin costo de licencia.</w:t>
+        <w:t>El desarrollo del sistema no requiere inversión en licencias de software, ya que todas las tecnologías utilizadas son de código abierto y uso gratuito. El costo del proyecto se limita al tiempo de desarrollo humano.</w:t>
       </w:r>
     </w:p>
     <w:p>
@@ -10894,23 +11114,21 @@
       </w:rPr>
       <w:t xml:space="preserve">Universidad Andina del </w:t>
     </w:r>
-    <w:proofErr w:type="gramStart"/>
     <w:r>
       <w:rPr>
         <w:color w:val="1A1A1A"/>
         <w:sz w:val="16"/>
         <w:szCs w:val="16"/>
       </w:rPr>
-      <w:t>Cusco  —</w:t>
+      <w:t>Cusco — Escuela</w:t>
     </w:r>
-    <w:proofErr w:type="gramEnd"/>
     <w:r>
       <w:rPr>
         <w:color w:val="1A1A1A"/>
         <w:sz w:val="16"/>
         <w:szCs w:val="16"/>
       </w:rPr>
-      <w:t xml:space="preserve">  Escuela Profesional de Ingeniería de Sistemas</w:t>
+      <w:t xml:space="preserve"> Profesional de Ingeniería de Sistemas</w:t>
     </w:r>
   </w:p>
 </w:ftr>
@@ -11016,7 +11234,6 @@
       </w:rPr>
       <w:t xml:space="preserve">Universidad Andina del </w:t>
     </w:r>
-    <w:proofErr w:type="gramStart"/>
     <w:r>
       <w:rPr>
         <w:i/>
@@ -11025,9 +11242,8 @@
         <w:sz w:val="16"/>
         <w:szCs w:val="16"/>
       </w:rPr>
-      <w:t>Cusco  —</w:t>
+      <w:t>Cusco — Documentación</w:t>
     </w:r>
-    <w:proofErr w:type="gramEnd"/>
     <w:r>
       <w:rPr>
         <w:i/>
@@ -11036,7 +11252,7 @@
         <w:sz w:val="16"/>
         <w:szCs w:val="16"/>
       </w:rPr>
-      <w:t xml:space="preserve">  Documentación de Proyecto de Software</w:t>
+      <w:t xml:space="preserve"> de Proyecto de Software</w:t>
     </w:r>
   </w:p>
 </w:hdr>
@@ -12427,6 +12643,17 @@
     <w:uiPriority w:val="99"/>
     <w:rsid w:val="004457F7"/>
   </w:style>
+  <w:style w:type="character" w:styleId="Textoennegrita">
+    <w:name w:val="Strong"/>
+    <w:basedOn w:val="Fuentedeprrafopredeter"/>
+    <w:uiPriority w:val="22"/>
+    <w:qFormat/>
+    <w:rsid w:val="002A765A"/>
+    <w:rPr>
+      <w:b/>
+      <w:bCs/>
+    </w:rPr>
+  </w:style>
 </w:styles>
 </file>
 

</xml_diff>